<commit_message>
Update Sunnyfield CMA for double-wide home-only premise
</commit_message>
<xml_diff>
--- a/Project Rooms/CMA Report - 5021 Sunnyfield Dr/outputs/5021-sunnyfield-cma-report.docx
+++ b/Project Rooms/CMA Report - 5021 Sunnyfield Dr/outputs/5021-sunnyfield-cma-report.docx
@@ -59,7 +59,7 @@
         <w:t>Property Type:</w:t>
       </w:r>
       <w:r>
-        <w:t xml:space="preserve"> Owner-provided manufactured home</w:t>
+        <w:t xml:space="preserve"> Owner-provided double-wide manufactured home</w:t>
       </w:r>
     </w:p>
     <w:p>
@@ -70,10 +70,10 @@
         <w:rPr>
           <w:b/>
         </w:rPr>
-        <w:t>Valuation Premise:</w:t>
-      </w:r>
-      <w:r>
-        <w:t xml:space="preserve"> Preliminary public-data scenario CMA; final use requires subject specifications, title/land status, and MLS/COMPER comps.</w:t>
+        <w:t>Ownership Premise:</w:t>
+      </w:r>
+      <w:r>
+        <w:t xml:space="preserve"> Land is not included.</w:t>
       </w:r>
     </w:p>
     <w:p>
@@ -89,7 +89,7 @@
         <w:pStyle w:val="Normal"/>
       </w:pPr>
       <w:r>
-        <w:t>The current public data is not sufficient to support a single final value because the subject manufactured home details and land/title status are unconfirmed. The value range changes materially depending on whether the home is sold as home-only on leased land or as land-owned real property.</w:t>
+        <w:t>Owner-provided information confirms the subject is a double-wide manufactured home and land is not included. Land-owned manufactured-home scenarios are therefore removed from the value conclusion. The current working indication is approximately $95,000 before condition adjustment.</w:t>
       </w:r>
     </w:p>
     <w:tbl>
@@ -204,7 +204,7 @@
               <w:spacing w:after="60"/>
             </w:pPr>
             <w:r>
-              <w:t>Home-only / leased-lot manufactured home</w:t>
+              <w:t>Home-only / leased-lot double-wide manufactured home</w:t>
             </w:r>
           </w:p>
         </w:tc>
@@ -223,7 +223,7 @@
               <w:spacing w:after="60"/>
             </w:pPr>
             <w:r>
-              <w:t>$60,000 to $95,000</w:t>
+              <w:t>$75,000 to $115,000</w:t>
             </w:r>
           </w:p>
         </w:tc>
@@ -242,7 +242,7 @@
               <w:spacing w:after="60"/>
             </w:pPr>
             <w:r>
-              <w:t>Approximately $75,000 before condition adjustment</w:t>
+              <w:t>Approximately $95,000 before condition adjustment</w:t>
             </w:r>
           </w:p>
         </w:tc>
@@ -263,7 +263,7 @@
               <w:spacing w:after="60"/>
             </w:pPr>
             <w:r>
-              <w:t>Land-owned manufactured home, average condition</w:t>
+              <w:t>Lower-condition, older, or high-lot-rent home</w:t>
             </w:r>
           </w:p>
         </w:tc>
@@ -282,7 +282,7 @@
               <w:spacing w:after="60"/>
             </w:pPr>
             <w:r>
-              <w:t>$190,000 to $250,000</w:t>
+              <w:t>Closer to $75,000</w:t>
             </w:r>
           </w:p>
         </w:tc>
@@ -301,7 +301,7 @@
               <w:spacing w:after="60"/>
             </w:pPr>
             <w:r>
-              <w:t>Approximately $225,000 to $250,000 before condition adjustment</w:t>
+              <w:t>Subject to condition and transfer terms</w:t>
             </w:r>
           </w:p>
         </w:tc>
@@ -322,7 +322,7 @@
               <w:spacing w:after="60"/>
             </w:pPr>
             <w:r>
-              <w:t>Land-owned manufactured home, larger or updated</w:t>
+              <w:t>Larger, updated double wide with favorable lot terms</w:t>
             </w:r>
           </w:p>
         </w:tc>
@@ -341,7 +341,7 @@
               <w:spacing w:after="60"/>
             </w:pPr>
             <w:r>
-              <w:t>$230,000 to $285,000</w:t>
+              <w:t>Low-$100k range</w:t>
             </w:r>
           </w:p>
         </w:tc>
@@ -360,7 +360,7 @@
               <w:spacing w:after="60"/>
             </w:pPr>
             <w:r>
-              <w:t>High-$200k upside if size, condition, land, and utilities support it</w:t>
+              <w:t>Requires clean title and favorable community terms</w:t>
             </w:r>
           </w:p>
         </w:tc>
@@ -384,7 +384,7 @@
         <w:pStyle w:val="Normal"/>
       </w:pPr>
       <w:r>
-        <w:t>This is a preliminary public-data CMA. Public sources reviewed during this pass did not confirm the subject year, square footage, bed/bath count, condition, land ownership, title status, or park/lot-rent terms. This report is not an appraisal, broker price opinion, or final pricing recommendation.</w:t>
+        <w:t>This is a preliminary public-data CMA. Public sources reviewed during this pass did not confirm the subject year, square footage, bed/bath count, condition, title status, or park/lot-rent terms. This report is not an appraisal, broker price opinion, or final pricing recommendation.</w:t>
       </w:r>
     </w:p>
     <w:p>
@@ -507,7 +507,7 @@
               <w:spacing w:after="60"/>
             </w:pPr>
             <w:r>
-              <w:t>Redfin 27610 market page</w:t>
+              <w:t>1104 Deep River Ct, Raleigh</w:t>
             </w:r>
           </w:p>
         </w:tc>
@@ -526,7 +526,7 @@
               <w:spacing w:after="60"/>
             </w:pPr>
             <w:r>
-              <w:t>Median sale price $329,402; down 4.5% YoY; 49 DOM</w:t>
+              <w:t>Active mobile-home listing at $74,900; 2 bed / 2 bath / 1,216 sq ft</w:t>
             </w:r>
           </w:p>
         </w:tc>
@@ -545,7 +545,7 @@
               <w:spacing w:after="60"/>
             </w:pPr>
             <w:r>
-              <w:t>Broad ZIP context only</w:t>
+              <w:t>Primary home-only/leased-lot lower-bound signal</w:t>
             </w:r>
           </w:p>
         </w:tc>
@@ -604,7 +604,7 @@
               <w:spacing w:after="60"/>
             </w:pPr>
             <w:r>
-              <w:t>Land-owned or retail manufactured-home signal</w:t>
+              <w:t>Non-controlling context because land is not included</w:t>
             </w:r>
           </w:p>
         </w:tc>
@@ -663,7 +663,7 @@
               <w:spacing w:after="60"/>
             </w:pPr>
             <w:r>
-              <w:t>Upper land-owned/retail listing signal</w:t>
+              <w:t>Non-controlling context because land is not included</w:t>
             </w:r>
           </w:p>
         </w:tc>
@@ -684,7 +684,7 @@
               <w:spacing w:after="60"/>
             </w:pPr>
             <w:r>
-              <w:t>1104 Deep River Ct, Raleigh</w:t>
+              <w:t>4308 Pearl Rd, Raleigh</w:t>
             </w:r>
           </w:p>
         </w:tc>
@@ -703,7 +703,7 @@
               <w:spacing w:after="60"/>
             </w:pPr>
             <w:r>
-              <w:t>Active mobile-home listing at $74,900; 2 bed / 2 bath / 1,216 sq ft</w:t>
+              <w:t>Manufactured/mobile property type; 2 bath / 1,620 sq ft</w:t>
             </w:r>
           </w:p>
         </w:tc>
@@ -722,7 +722,7 @@
               <w:spacing w:after="60"/>
             </w:pPr>
             <w:r>
-              <w:t>Home-only/leased-lot lower-bound signal</w:t>
+              <w:t>Product-type context only</w:t>
             </w:r>
           </w:p>
         </w:tc>
@@ -743,65 +743,6 @@
               <w:spacing w:after="60"/>
             </w:pPr>
             <w:r>
-              <w:t>4308 Pearl Rd, Raleigh</w:t>
-            </w:r>
-          </w:p>
-        </w:tc>
-        <w:tc>
-          <w:tcPr>
-            <w:tcW w:w="3400" w:type="dxa"/>
-            <w:tcMar>
-              <w:top w:w="80" w:type="dxa"/>
-              <w:bottom w:w="80" w:type="dxa"/>
-              <w:left w:w="120" w:type="dxa"/>
-              <w:right w:w="120" w:type="dxa"/>
-            </w:tcMar>
-          </w:tcPr>
-          <w:p>
-            <w:pPr>
-              <w:spacing w:after="60"/>
-            </w:pPr>
-            <w:r>
-              <w:t>Manufactured/mobile property type; 2 bath / 1,620 sq ft</w:t>
-            </w:r>
-          </w:p>
-        </w:tc>
-        <w:tc>
-          <w:tcPr>
-            <w:tcW w:w="3360" w:type="dxa"/>
-            <w:tcMar>
-              <w:top w:w="80" w:type="dxa"/>
-              <w:bottom w:w="80" w:type="dxa"/>
-              <w:left w:w="120" w:type="dxa"/>
-              <w:right w:w="120" w:type="dxa"/>
-            </w:tcMar>
-          </w:tcPr>
-          <w:p>
-            <w:pPr>
-              <w:spacing w:after="60"/>
-            </w:pPr>
-            <w:r>
-              <w:t>Product-type context only</w:t>
-            </w:r>
-          </w:p>
-        </w:tc>
-      </w:tr>
-      <w:tr>
-        <w:tc>
-          <w:tcPr>
-            <w:tcW w:w="2600" w:type="dxa"/>
-            <w:tcMar>
-              <w:top w:w="80" w:type="dxa"/>
-              <w:bottom w:w="80" w:type="dxa"/>
-              <w:left w:w="120" w:type="dxa"/>
-              <w:right w:w="120" w:type="dxa"/>
-            </w:tcMar>
-          </w:tcPr>
-          <w:p>
-            <w:pPr>
-              <w:spacing w:after="60"/>
-            </w:pPr>
-            <w:r>
               <w:t>2217 Holiday Dr, Raleigh</w:t>
             </w:r>
           </w:p>
@@ -865,7 +806,7 @@
         <w:ind w:left="720" w:hanging="360"/>
       </w:pPr>
       <w:r>
-        <w:t>- Confirm whether the sale includes land or is home-only.</w:t>
+        <w:t>- Confirm lot/community arrangement and monthly lot rent.</w:t>
       </w:r>
     </w:p>
     <w:p>
@@ -892,7 +833,7 @@
         <w:ind w:left="720" w:hanging="360"/>
       </w:pPr>
       <w:r>
-        <w:t>- Pull MLS or COMPER closed sales for manufactured homes with matching land/title status.</w:t>
+        <w:t>- Pull MLS or COMPER closed sales for home-only or leased-lot manufactured homes.</w:t>
       </w:r>
     </w:p>
     <w:p>
@@ -901,7 +842,7 @@
         <w:ind w:left="720" w:hanging="360"/>
       </w:pPr>
       <w:r>
-        <w:t>- Confirm lot rent, community rules, transfer requirements, and fees if leased-lot.</w:t>
+        <w:t>- Confirm community rules, transfer requirements, and fees if leased-lot.</w:t>
       </w:r>
     </w:p>
     <w:p>
@@ -917,7 +858,7 @@
         <w:pStyle w:val="Normal"/>
       </w:pPr>
       <w:r>
-        <w:t>Source notes and public links are maintained in Project Rooms/CMA Report - 5021 Sunnyfield Dr/sources/public-web-source-notes.md.</w:t>
+        <w:t>Source notes and public links are maintained in Project Rooms/CMA Report - 5021 Sunnyfield Dr/sources/public-web-source-notes.md. The double-wide and land-not-included facts are Owner-provided.</w:t>
       </w:r>
     </w:p>
     <w:sectPr>

</xml_diff>